<commit_message>
Add CPM author email candidate lookup
</commit_message>
<xml_diff>
--- a/manuscript/computational_particle_mechanics_live_submission_packet.docx
+++ b/manuscript/computational_particle_mechanics_live_submission_packet.docx
@@ -291,6 +291,78 @@
                 <w:sz w:val="17"/>
               </w:rPr>
               <w:t>7</w:t>
+            </w:r>
+          </w:p>
+        </w:tc>
+      </w:tr>
+      <w:tr>
+        <w:tc>
+          <w:tcPr>
+            <w:tcW w:type="dxa" w:w="4968"/>
+            <w:vAlign w:val="center"/>
+          </w:tcPr>
+          <w:p>
+            <w:r/>
+            <w:r>
+              <w:rPr>
+                <w:rFonts w:ascii="Arial" w:hAnsi="Arial"/>
+                <w:b w:val="0"/>
+                <w:sz w:val="17"/>
+              </w:rPr>
+              <w:t>Public candidate e-mail lookup</w:t>
+            </w:r>
+          </w:p>
+        </w:tc>
+        <w:tc>
+          <w:tcPr>
+            <w:tcW w:type="dxa" w:w="4968"/>
+            <w:vAlign w:val="center"/>
+          </w:tcPr>
+          <w:p>
+            <w:r/>
+            <w:r>
+              <w:rPr>
+                <w:rFonts w:ascii="Arial" w:hAnsi="Arial"/>
+                <w:b w:val="0"/>
+                <w:sz w:val="17"/>
+              </w:rPr>
+              <w:t>docs/cpm_author_email_public_lookup_20260704.md</w:t>
+            </w:r>
+          </w:p>
+        </w:tc>
+      </w:tr>
+      <w:tr>
+        <w:tc>
+          <w:tcPr>
+            <w:tcW w:type="dxa" w:w="4968"/>
+            <w:vAlign w:val="center"/>
+          </w:tcPr>
+          <w:p>
+            <w:r/>
+            <w:r>
+              <w:rPr>
+                <w:rFonts w:ascii="Arial" w:hAnsi="Arial"/>
+                <w:b w:val="0"/>
+                <w:sz w:val="17"/>
+              </w:rPr>
+              <w:t>Public candidate e-mails</w:t>
+            </w:r>
+          </w:p>
+        </w:tc>
+        <w:tc>
+          <w:tcPr>
+            <w:tcW w:type="dxa" w:w="4968"/>
+            <w:vAlign w:val="center"/>
+          </w:tcPr>
+          <w:p>
+            <w:r/>
+            <w:r>
+              <w:rPr>
+                <w:rFonts w:ascii="Arial" w:hAnsi="Arial"/>
+                <w:b w:val="0"/>
+                <w:sz w:val="17"/>
+              </w:rPr>
+              <w:t>2</w:t>
             </w:r>
           </w:p>
         </w:tc>
@@ -1823,6 +1895,243 @@
         <w:pStyle w:val="Heading1"/>
       </w:pPr>
       <w:r>
+        <w:t>Public Candidate E-mail Lookup</w:t>
+      </w:r>
+    </w:p>
+    <w:p>
+      <w:r>
+        <w:t>These entries are public candidates for corresponding-author confirmation; they do not change the formal missing-email count.</w:t>
+      </w:r>
+    </w:p>
+    <w:tbl>
+      <w:tblPr>
+        <w:tblStyle w:val="TableGrid"/>
+        <w:tblW w:type="auto" w:w="0"/>
+        <w:tblLayout w:type="autofit"/>
+        <w:tblLook w:firstColumn="1" w:firstRow="1" w:lastColumn="0" w:lastRow="0" w:noHBand="0" w:noVBand="1" w:val="04A0"/>
+      </w:tblPr>
+      <w:tblGrid>
+        <w:gridCol w:w="2484"/>
+        <w:gridCol w:w="2484"/>
+        <w:gridCol w:w="2484"/>
+        <w:gridCol w:w="2484"/>
+      </w:tblGrid>
+      <w:tr>
+        <w:tc>
+          <w:tcPr>
+            <w:tcW w:type="dxa" w:w="2484"/>
+            <w:vAlign w:val="center"/>
+          </w:tcPr>
+          <w:p>
+            <w:r/>
+            <w:r>
+              <w:rPr>
+                <w:rFonts w:ascii="Arial" w:hAnsi="Arial"/>
+                <w:b/>
+                <w:sz w:val="17"/>
+              </w:rPr>
+              <w:t>Author</w:t>
+            </w:r>
+          </w:p>
+        </w:tc>
+        <w:tc>
+          <w:tcPr>
+            <w:tcW w:type="dxa" w:w="2484"/>
+            <w:vAlign w:val="center"/>
+          </w:tcPr>
+          <w:p>
+            <w:r/>
+            <w:r>
+              <w:rPr>
+                <w:rFonts w:ascii="Arial" w:hAnsi="Arial"/>
+                <w:b/>
+                <w:sz w:val="17"/>
+              </w:rPr>
+              <w:t>Candidate e-mail</w:t>
+            </w:r>
+          </w:p>
+        </w:tc>
+        <w:tc>
+          <w:tcPr>
+            <w:tcW w:type="dxa" w:w="2484"/>
+            <w:vAlign w:val="center"/>
+          </w:tcPr>
+          <w:p>
+            <w:r/>
+            <w:r>
+              <w:rPr>
+                <w:rFonts w:ascii="Arial" w:hAnsi="Arial"/>
+                <w:b/>
+                <w:sz w:val="17"/>
+              </w:rPr>
+              <w:t>Status</w:t>
+            </w:r>
+          </w:p>
+        </w:tc>
+        <w:tc>
+          <w:tcPr>
+            <w:tcW w:type="dxa" w:w="2484"/>
+            <w:vAlign w:val="center"/>
+          </w:tcPr>
+          <w:p>
+            <w:r/>
+            <w:r>
+              <w:rPr>
+                <w:rFonts w:ascii="Arial" w:hAnsi="Arial"/>
+                <w:b/>
+                <w:sz w:val="17"/>
+              </w:rPr>
+              <w:t>Source</w:t>
+            </w:r>
+          </w:p>
+        </w:tc>
+      </w:tr>
+      <w:tr>
+        <w:tc>
+          <w:tcPr>
+            <w:tcW w:type="dxa" w:w="2484"/>
+            <w:vAlign w:val="center"/>
+          </w:tcPr>
+          <w:p>
+            <w:r/>
+            <w:r>
+              <w:rPr>
+                <w:rFonts w:ascii="Arial" w:hAnsi="Arial"/>
+                <w:b w:val="0"/>
+                <w:sz w:val="17"/>
+              </w:rPr>
+              <w:t>Gang Shen</w:t>
+            </w:r>
+          </w:p>
+        </w:tc>
+        <w:tc>
+          <w:tcPr>
+            <w:tcW w:type="dxa" w:w="2484"/>
+            <w:vAlign w:val="center"/>
+          </w:tcPr>
+          <w:p>
+            <w:r/>
+            <w:r>
+              <w:rPr>
+                <w:rFonts w:ascii="Arial" w:hAnsi="Arial"/>
+                <w:b w:val="0"/>
+                <w:sz w:val="17"/>
+              </w:rPr>
+              <w:t>shenganghit@163.com</w:t>
+            </w:r>
+          </w:p>
+        </w:tc>
+        <w:tc>
+          <w:tcPr>
+            <w:tcW w:type="dxa" w:w="2484"/>
+            <w:vAlign w:val="center"/>
+          </w:tcPr>
+          <w:p>
+            <w:r/>
+            <w:r>
+              <w:rPr>
+                <w:rFonts w:ascii="Arial" w:hAnsi="Arial"/>
+                <w:b w:val="0"/>
+                <w:sz w:val="17"/>
+              </w:rPr>
+              <w:t>Public candidate; confirm before final submission</w:t>
+            </w:r>
+          </w:p>
+        </w:tc>
+        <w:tc>
+          <w:tcPr>
+            <w:tcW w:type="dxa" w:w="2484"/>
+            <w:vAlign w:val="center"/>
+          </w:tcPr>
+          <w:p>
+            <w:r/>
+            <w:r>
+              <w:rPr>
+                <w:rFonts w:ascii="Arial" w:hAnsi="Arial"/>
+                <w:b w:val="0"/>
+                <w:sz w:val="17"/>
+              </w:rPr>
+              <w:t>https://journals.sagepub.com/doi/10.1177/09544062241299521</w:t>
+            </w:r>
+          </w:p>
+        </w:tc>
+      </w:tr>
+      <w:tr>
+        <w:tc>
+          <w:tcPr>
+            <w:tcW w:type="dxa" w:w="2484"/>
+            <w:vAlign w:val="center"/>
+          </w:tcPr>
+          <w:p>
+            <w:r/>
+            <w:r>
+              <w:rPr>
+                <w:rFonts w:ascii="Arial" w:hAnsi="Arial"/>
+                <w:b w:val="0"/>
+                <w:sz w:val="17"/>
+              </w:rPr>
+              <w:t>Haishun Deng</w:t>
+            </w:r>
+          </w:p>
+        </w:tc>
+        <w:tc>
+          <w:tcPr>
+            <w:tcW w:type="dxa" w:w="2484"/>
+            <w:vAlign w:val="center"/>
+          </w:tcPr>
+          <w:p>
+            <w:r/>
+            <w:r>
+              <w:rPr>
+                <w:rFonts w:ascii="Arial" w:hAnsi="Arial"/>
+                <w:b w:val="0"/>
+                <w:sz w:val="17"/>
+              </w:rPr>
+              <w:t>269469122@qq.com</w:t>
+            </w:r>
+          </w:p>
+        </w:tc>
+        <w:tc>
+          <w:tcPr>
+            <w:tcW w:type="dxa" w:w="2484"/>
+            <w:vAlign w:val="center"/>
+          </w:tcPr>
+          <w:p>
+            <w:r/>
+            <w:r>
+              <w:rPr>
+                <w:rFonts w:ascii="Arial" w:hAnsi="Arial"/>
+                <w:b w:val="0"/>
+                <w:sz w:val="17"/>
+              </w:rPr>
+              <w:t>Public candidate; confirm before final submission</w:t>
+            </w:r>
+          </w:p>
+        </w:tc>
+        <w:tc>
+          <w:tcPr>
+            <w:tcW w:type="dxa" w:w="2484"/>
+            <w:vAlign w:val="center"/>
+          </w:tcPr>
+          <w:p>
+            <w:r/>
+            <w:r>
+              <w:rPr>
+                <w:rFonts w:ascii="Arial" w:hAnsi="Arial"/>
+                <w:b w:val="0"/>
+                <w:sz w:val="17"/>
+              </w:rPr>
+              <w:t>https://pmc.ncbi.nlm.nih.gov/articles/PMC11637116/</w:t>
+            </w:r>
+          </w:p>
+        </w:tc>
+      </w:tr>
+    </w:tbl>
+    <w:p>
+      <w:pPr>
+        <w:pStyle w:val="Heading1"/>
+      </w:pPr>
+      <w:r>
         <w:t>Final External Actions</w:t>
       </w:r>
     </w:p>
@@ -1832,6 +2141,14 @@
       </w:pPr>
       <w:r>
         <w:t>Fill seven coauthor e-mail addresses if required by the live submission system.</w:t>
+      </w:r>
+    </w:p>
+    <w:p>
+      <w:pPr>
+        <w:pStyle w:val="ListBullet"/>
+      </w:pPr>
+      <w:r>
+        <w:t>Confirm public candidate e-mails for Gang Shen and Haishun Deng before using them in the live system.</w:t>
       </w:r>
     </w:p>
     <w:p>

</xml_diff>